<commit_message>
Resume: Information Security Analyst (Incident Response) @ Burns & McDonnell India (MNC)
</commit_message>
<xml_diff>
--- a/resumes/Resume_Information_Security_Analyst__Incid_Burns___McDonnell_India__MNC_.docx
+++ b/resumes/Resume_Information_Security_Analyst__Incid_Burns___McDonnell_India__MNC_.docx
@@ -430,7 +430,7 @@
           <w:sz w:val="19"/>
           <w:szCs w:val="19"/>
         </w:rPr>
-        <w:t>Triaged 50+ weekly inventory reimbursement cases by severity and policy eligibility, following structured case triage and escalation workflows, resulting in timely and accurate issue resolution.</w:t>
+        <w:t>Triaged 50+ weekly inventory reimbursement cases by severity and policy eligibility, translating high-volume case review into alert triage, severity classification, and escalation routing.</w:t>
       </w:r>
     </w:p>
     <w:p>
@@ -449,7 +449,7 @@
           <w:sz w:val="19"/>
           <w:szCs w:val="19"/>
         </w:rPr>
-        <w:t>Investigated seller claims, identified policy violations and anomalous patterns, and escalated findings to senior reviewers, leading to improved case resolution efficiency.</w:t>
+        <w:t>Conducted root cause analysis on seller claims, identifying policy violations and anomalous patterns for pattern review and investigation handoffs.</w:t>
       </w:r>
     </w:p>
     <w:p>
@@ -468,7 +468,7 @@
           <w:sz w:val="19"/>
           <w:szCs w:val="19"/>
         </w:rPr>
-        <w:t>Analyzed root cause of seller claims, documenting investigation findings, decisions, evidence notes, and corrective actions, maintaining audit-ready case records.</w:t>
+        <w:t>Maintained audit-ready case documentation with findings, decisions, evidence notes, and corrective actions aligned to evidence documentation and decision trails.</w:t>
       </w:r>
     </w:p>
     <w:p>
@@ -487,7 +487,7 @@
           <w:sz w:val="19"/>
           <w:szCs w:val="19"/>
         </w:rPr>
-        <w:t>Detected recurring fraud patterns across 200+ weekly cases, flagging them early and reducing repeat-issue investigation time before escalation, resulting in significant cost savings.</w:t>
+        <w:t>Spotted recurring fraud patterns across 200+ weekly cases and flagged repeat issues early, reducing investigation cycles before escalation.</w:t>
       </w:r>
     </w:p>
     <w:p>
@@ -588,7 +588,7 @@
           <w:sz w:val="19"/>
           <w:szCs w:val="19"/>
         </w:rPr>
-        <w:t>Deployed Splunk SIEM with SPL correlation searches for brute-force detection, lateral movement, and privilege escalation; mapped TTPs to MITRE ATT&amp;CK and wrote incident report in PICERL format.</w:t>
+        <w:t>Deployed Splunk SIEM with SPL correlation searches for brute-force detection, lateral movement, and privilege escalation; mapped TTPs to MITRE ATT&amp;CK and wrote PICERL incident report for FIRST.org.</w:t>
       </w:r>
     </w:p>
     <w:p>
@@ -607,7 +607,7 @@
           <w:sz w:val="19"/>
           <w:szCs w:val="19"/>
         </w:rPr>
-        <w:t>Developed Python script to ingest Splunk alerts, enrich with VirusTotal API, and dispatch Telegram notifications with severity classification.</w:t>
+        <w:t>Developed SOAR-style detection pipeline: Python script ingests Splunk alerts, enriches with VirusTotal API, and dispatches Telegram notifications with severity classification.</w:t>
       </w:r>
     </w:p>
     <w:p>
@@ -626,7 +626,7 @@
           <w:sz w:val="19"/>
           <w:szCs w:val="19"/>
         </w:rPr>
-        <w:t>Converted detection logic to Sigma rules (detection-as-code) and performed TCP/IP analysis in Wireshark to detect SYN scans, DNS tunnelling, and plaintext credential exposure on unencrypted sessions.</w:t>
+        <w:t>Converted detection logic to Sigma rules for enterprise SOCs; analyzed TCP/IP traffic in Wireshark for SYN scans, DNS tunnelling, and plaintext credential exposure.</w:t>
       </w:r>
     </w:p>
     <w:p>
@@ -697,7 +697,7 @@
           <w:sz w:val="19"/>
           <w:szCs w:val="19"/>
         </w:rPr>
-        <w:t>Built multi-API threat intelligence pipeline submitting suspicious URLs/IPs to VirusTotal, AbuseIPDB, and URLScan.io, cross-referencing WHOIS, DNS, and SSL details for phishing analysis.</w:t>
+        <w:t>Built multi-API threat intelligence pipeline: submits suspicious data to VirusTotal, AbuseIPDB, and URLScan.io, cross-referencing WHOIS, DNS, and SSL details for phishing analysis.</w:t>
       </w:r>
     </w:p>
     <w:p>

</xml_diff>